<commit_message>
Ajout estimation cout API Claude
</commit_message>
<xml_diff>
--- a/Note - Propriete et Architecture IA.docx
+++ b/Note - Propriete et Architecture IA.docx
@@ -161,6 +161,844 @@
       </w:pPr>
       <w:r>
         <w:t xml:space="preserve">Un modèle réellement auto-hébergé (point 3) reste une option pour plus tard, si l'indépendance vis-à-vis de tout fournisseur d'API devient un critère prioritaire — mais cela suppose d'abord d'avoir constitué un dataset labellisé via les résultats de la phase 1, ce qui n'existe pas encore aujourd'hui.</w:t>
+      </w:r>
+    </w:p>
+    <w:p>
+      <w:pPr>
+        <w:pStyle w:val="Heading1"/>
+        <w:spacing w:after="150" w:before="300"/>
+      </w:pPr>
+      <w:r>
+        <w:t xml:space="preserve">Estimation du coût de l'API Claude (phase 1)</w:t>
+      </w:r>
+    </w:p>
+    <w:p>
+      <w:pPr>
+        <w:spacing w:after="150"/>
+      </w:pPr>
+      <w:r>
+        <w:rPr>
+          <w:i/>
+          <w:iCs/>
+          <w:color w:val="555555"/>
+        </w:rPr>
+        <w:t xml:space="preserve">Addendum du 2026-08-30, en réponse à la question : « combien cela coûtera d'utiliser l'API de Claude ? »</w:t>
+      </w:r>
+    </w:p>
+    <w:p>
+      <w:pPr>
+        <w:spacing w:after="200"/>
+      </w:pPr>
+      <w:r>
+        <w:t xml:space="preserve">L'API Claude est facturée au token consommé, sans abonnement mensuel fixe — le coût dépend directement du volume de photos analysées. Ce qui compose un appel « une photo → un résultat qualifié » :</w:t>
+      </w:r>
+    </w:p>
+    <w:p>
+      <w:pPr>
+        <w:pStyle w:val="ListParagraph"/>
+        <w:numPr>
+          <w:ilvl w:val="0"/>
+          <w:numId w:val="3"/>
+        </w:numPr>
+        <w:spacing w:after="100"/>
+      </w:pPr>
+      <w:r>
+        <w:t xml:space="preserve">L'image elle-même : environ 1 000 à 1 600 tokens selon sa résolution (l'API la redimensionne automatiquement ; ~750 pixels = 1 token).</w:t>
+      </w:r>
+    </w:p>
+    <w:p>
+      <w:pPr>
+        <w:pStyle w:val="ListParagraph"/>
+        <w:numPr>
+          <w:ilvl w:val="0"/>
+          <w:numId w:val="3"/>
+        </w:numPr>
+        <w:spacing w:after="100"/>
+      </w:pPr>
+      <w:r>
+        <w:t xml:space="preserve">Le prompt d'instructions (taxonomie I&amp;V, règles de démérite) : quelques centaines de tokens, réductibles de ~90% via le cache de prompt puisque ce bloc ne change pas d'une photo à l'autre.</w:t>
+      </w:r>
+    </w:p>
+    <w:p>
+      <w:pPr>
+        <w:pStyle w:val="ListParagraph"/>
+        <w:numPr>
+          <w:ilvl w:val="0"/>
+          <w:numId w:val="3"/>
+        </w:numPr>
+        <w:spacing w:after="100"/>
+      </w:pPr>
+      <w:r>
+        <w:t xml:space="preserve">La réponse structurée (type d'incivilité, score de démérite, justification courte) : environ 200 à 400 tokens de sortie.</w:t>
+      </w:r>
+    </w:p>
+    <w:p>
+      <w:pPr>
+        <w:spacing w:after="200"/>
+      </w:pPr>
+      <w:r>
+        <w:rPr>
+          <w:i/>
+          <w:iCs/>
+          <w:color w:val="555555"/>
+        </w:rPr>
+        <w:t xml:space="preserve">Hypothèse retenue pour les estimations ci-dessous : ~1 500 tokens en entrée et ~300 en sortie par photo, hors cache.</w:t>
+      </w:r>
+    </w:p>
+    <w:p>
+      <w:pPr>
+        <w:pStyle w:val="Heading2"/>
+        <w:spacing w:after="100" w:before="200"/>
+      </w:pPr>
+      <w:r>
+        <w:t xml:space="preserve">Tarifs par modèle (par million de tokens)</w:t>
+      </w:r>
+    </w:p>
+    <w:tbl>
+      <w:tblPr>
+        <w:tblW w:type="dxa" w:w="9360"/>
+        <w:tblBorders>
+          <w:top w:val="single" w:color="auto" w:sz="4"/>
+          <w:left w:val="single" w:color="auto" w:sz="4"/>
+          <w:bottom w:val="single" w:color="auto" w:sz="4"/>
+          <w:right w:val="single" w:color="auto" w:sz="4"/>
+          <w:insideH w:val="single" w:color="auto" w:sz="4"/>
+          <w:insideV w:val="single" w:color="auto" w:sz="4"/>
+        </w:tblBorders>
+      </w:tblPr>
+      <w:tblGrid>
+        <w:gridCol w:w="3200"/>
+        <w:gridCol w:w="2100"/>
+        <w:gridCol w:w="2100"/>
+        <w:gridCol w:w="1960"/>
+      </w:tblGrid>
+      <w:tr>
+        <w:tc>
+          <w:tcPr>
+            <w:tcW w:type="dxa" w:w="3200"/>
+            <w:shd w:fill="540E28" w:val="clear"/>
+            <w:tcMar>
+              <w:top w:type="dxa" w:w="80"/>
+              <w:left w:type="dxa" w:w="100"/>
+              <w:bottom w:type="dxa" w:w="80"/>
+              <w:right w:type="dxa" w:w="100"/>
+            </w:tcMar>
+            <w:vAlign w:val="center"/>
+          </w:tcPr>
+          <w:p>
+            <w:r>
+              <w:rPr>
+                <w:b/>
+                <w:bCs/>
+                <w:color w:val="FFFFFF"/>
+                <w:sz w:val="20"/>
+                <w:szCs w:val="20"/>
+              </w:rPr>
+              <w:t xml:space="preserve">Modèle</w:t>
+            </w:r>
+          </w:p>
+        </w:tc>
+        <w:tc>
+          <w:tcPr>
+            <w:tcW w:type="dxa" w:w="2100"/>
+            <w:shd w:fill="540E28" w:val="clear"/>
+            <w:tcMar>
+              <w:top w:type="dxa" w:w="80"/>
+              <w:left w:type="dxa" w:w="100"/>
+              <w:bottom w:type="dxa" w:w="80"/>
+              <w:right w:type="dxa" w:w="100"/>
+            </w:tcMar>
+            <w:vAlign w:val="center"/>
+          </w:tcPr>
+          <w:p>
+            <w:r>
+              <w:rPr>
+                <w:b/>
+                <w:bCs/>
+                <w:color w:val="FFFFFF"/>
+                <w:sz w:val="20"/>
+                <w:szCs w:val="20"/>
+              </w:rPr>
+              <w:t xml:space="preserve">Entrée ($/1M)</w:t>
+            </w:r>
+          </w:p>
+        </w:tc>
+        <w:tc>
+          <w:tcPr>
+            <w:tcW w:type="dxa" w:w="2100"/>
+            <w:shd w:fill="540E28" w:val="clear"/>
+            <w:tcMar>
+              <w:top w:type="dxa" w:w="80"/>
+              <w:left w:type="dxa" w:w="100"/>
+              <w:bottom w:type="dxa" w:w="80"/>
+              <w:right w:type="dxa" w:w="100"/>
+            </w:tcMar>
+            <w:vAlign w:val="center"/>
+          </w:tcPr>
+          <w:p>
+            <w:r>
+              <w:rPr>
+                <w:b/>
+                <w:bCs/>
+                <w:color w:val="FFFFFF"/>
+                <w:sz w:val="20"/>
+                <w:szCs w:val="20"/>
+              </w:rPr>
+              <w:t xml:space="preserve">Sortie ($/1M)</w:t>
+            </w:r>
+          </w:p>
+        </w:tc>
+        <w:tc>
+          <w:tcPr>
+            <w:tcW w:type="dxa" w:w="1960"/>
+            <w:shd w:fill="540E28" w:val="clear"/>
+            <w:tcMar>
+              <w:top w:type="dxa" w:w="80"/>
+              <w:left w:type="dxa" w:w="100"/>
+              <w:bottom w:type="dxa" w:w="80"/>
+              <w:right w:type="dxa" w:w="100"/>
+            </w:tcMar>
+            <w:vAlign w:val="center"/>
+          </w:tcPr>
+          <w:p>
+            <w:r>
+              <w:rPr>
+                <w:b/>
+                <w:bCs/>
+                <w:color w:val="FFFFFF"/>
+                <w:sz w:val="20"/>
+                <w:szCs w:val="20"/>
+              </w:rPr>
+              <w:t xml:space="preserve">Coût estimé / photo</w:t>
+            </w:r>
+          </w:p>
+        </w:tc>
+      </w:tr>
+      <w:tr>
+        <w:tc>
+          <w:tcPr>
+            <w:tcW w:type="dxa" w:w="3200"/>
+            <w:tcMar>
+              <w:top w:type="dxa" w:w="80"/>
+              <w:left w:type="dxa" w:w="100"/>
+              <w:bottom w:type="dxa" w:w="80"/>
+              <w:right w:type="dxa" w:w="100"/>
+            </w:tcMar>
+            <w:vAlign w:val="center"/>
+          </w:tcPr>
+          <w:p>
+            <w:r>
+              <w:rPr>
+                <w:b w:val="false"/>
+                <w:bCs w:val="false"/>
+                <w:sz w:val="20"/>
+                <w:szCs w:val="20"/>
+              </w:rPr>
+              <w:t xml:space="preserve">Haiku 4.5 (le plus léger)</w:t>
+            </w:r>
+          </w:p>
+        </w:tc>
+        <w:tc>
+          <w:tcPr>
+            <w:tcW w:type="dxa" w:w="2100"/>
+            <w:tcMar>
+              <w:top w:type="dxa" w:w="80"/>
+              <w:left w:type="dxa" w:w="100"/>
+              <w:bottom w:type="dxa" w:w="80"/>
+              <w:right w:type="dxa" w:w="100"/>
+            </w:tcMar>
+            <w:vAlign w:val="center"/>
+          </w:tcPr>
+          <w:p>
+            <w:r>
+              <w:rPr>
+                <w:b w:val="false"/>
+                <w:bCs w:val="false"/>
+                <w:sz w:val="20"/>
+                <w:szCs w:val="20"/>
+              </w:rPr>
+              <w:t xml:space="preserve">$1,00</w:t>
+            </w:r>
+          </w:p>
+        </w:tc>
+        <w:tc>
+          <w:tcPr>
+            <w:tcW w:type="dxa" w:w="2100"/>
+            <w:tcMar>
+              <w:top w:type="dxa" w:w="80"/>
+              <w:left w:type="dxa" w:w="100"/>
+              <w:bottom w:type="dxa" w:w="80"/>
+              <w:right w:type="dxa" w:w="100"/>
+            </w:tcMar>
+            <w:vAlign w:val="center"/>
+          </w:tcPr>
+          <w:p>
+            <w:r>
+              <w:rPr>
+                <w:b w:val="false"/>
+                <w:bCs w:val="false"/>
+                <w:sz w:val="20"/>
+                <w:szCs w:val="20"/>
+              </w:rPr>
+              <w:t xml:space="preserve">$5,00</w:t>
+            </w:r>
+          </w:p>
+        </w:tc>
+        <w:tc>
+          <w:tcPr>
+            <w:tcW w:type="dxa" w:w="1960"/>
+            <w:tcMar>
+              <w:top w:type="dxa" w:w="80"/>
+              <w:left w:type="dxa" w:w="100"/>
+              <w:bottom w:type="dxa" w:w="80"/>
+              <w:right w:type="dxa" w:w="100"/>
+            </w:tcMar>
+            <w:vAlign w:val="center"/>
+          </w:tcPr>
+          <w:p>
+            <w:r>
+              <w:rPr>
+                <w:b w:val="false"/>
+                <w:bCs w:val="false"/>
+                <w:sz w:val="20"/>
+                <w:szCs w:val="20"/>
+              </w:rPr>
+              <w:t xml:space="preserve">≈ $0,003</w:t>
+            </w:r>
+          </w:p>
+        </w:tc>
+      </w:tr>
+      <w:tr>
+        <w:tc>
+          <w:tcPr>
+            <w:tcW w:type="dxa" w:w="3200"/>
+            <w:tcMar>
+              <w:top w:type="dxa" w:w="80"/>
+              <w:left w:type="dxa" w:w="100"/>
+              <w:bottom w:type="dxa" w:w="80"/>
+              <w:right w:type="dxa" w:w="100"/>
+            </w:tcMar>
+            <w:vAlign w:val="center"/>
+          </w:tcPr>
+          <w:p>
+            <w:r>
+              <w:rPr>
+                <w:b w:val="false"/>
+                <w:bCs w:val="false"/>
+                <w:sz w:val="20"/>
+                <w:szCs w:val="20"/>
+              </w:rPr>
+              <w:t xml:space="preserve">Sonnet 5</w:t>
+            </w:r>
+          </w:p>
+        </w:tc>
+        <w:tc>
+          <w:tcPr>
+            <w:tcW w:type="dxa" w:w="2100"/>
+            <w:tcMar>
+              <w:top w:type="dxa" w:w="80"/>
+              <w:left w:type="dxa" w:w="100"/>
+              <w:bottom w:type="dxa" w:w="80"/>
+              <w:right w:type="dxa" w:w="100"/>
+            </w:tcMar>
+            <w:vAlign w:val="center"/>
+          </w:tcPr>
+          <w:p>
+            <w:r>
+              <w:rPr>
+                <w:b w:val="false"/>
+                <w:bCs w:val="false"/>
+                <w:sz w:val="20"/>
+                <w:szCs w:val="20"/>
+              </w:rPr>
+              <w:t xml:space="preserve">$2,00</w:t>
+            </w:r>
+          </w:p>
+        </w:tc>
+        <w:tc>
+          <w:tcPr>
+            <w:tcW w:type="dxa" w:w="2100"/>
+            <w:tcMar>
+              <w:top w:type="dxa" w:w="80"/>
+              <w:left w:type="dxa" w:w="100"/>
+              <w:bottom w:type="dxa" w:w="80"/>
+              <w:right w:type="dxa" w:w="100"/>
+            </w:tcMar>
+            <w:vAlign w:val="center"/>
+          </w:tcPr>
+          <w:p>
+            <w:r>
+              <w:rPr>
+                <w:b w:val="false"/>
+                <w:bCs w:val="false"/>
+                <w:sz w:val="20"/>
+                <w:szCs w:val="20"/>
+              </w:rPr>
+              <w:t xml:space="preserve">$10,00</w:t>
+            </w:r>
+          </w:p>
+        </w:tc>
+        <w:tc>
+          <w:tcPr>
+            <w:tcW w:type="dxa" w:w="1960"/>
+            <w:tcMar>
+              <w:top w:type="dxa" w:w="80"/>
+              <w:left w:type="dxa" w:w="100"/>
+              <w:bottom w:type="dxa" w:w="80"/>
+              <w:right w:type="dxa" w:w="100"/>
+            </w:tcMar>
+            <w:vAlign w:val="center"/>
+          </w:tcPr>
+          <w:p>
+            <w:r>
+              <w:rPr>
+                <w:b w:val="false"/>
+                <w:bCs w:val="false"/>
+                <w:sz w:val="20"/>
+                <w:szCs w:val="20"/>
+              </w:rPr>
+              <w:t xml:space="preserve">≈ $0,006</w:t>
+            </w:r>
+          </w:p>
+        </w:tc>
+      </w:tr>
+      <w:tr>
+        <w:tc>
+          <w:tcPr>
+            <w:tcW w:type="dxa" w:w="3200"/>
+            <w:tcMar>
+              <w:top w:type="dxa" w:w="80"/>
+              <w:left w:type="dxa" w:w="100"/>
+              <w:bottom w:type="dxa" w:w="80"/>
+              <w:right w:type="dxa" w:w="100"/>
+            </w:tcMar>
+            <w:vAlign w:val="center"/>
+          </w:tcPr>
+          <w:p>
+            <w:r>
+              <w:rPr>
+                <w:b w:val="false"/>
+                <w:bCs w:val="false"/>
+                <w:sz w:val="20"/>
+                <w:szCs w:val="20"/>
+              </w:rPr>
+              <w:t xml:space="preserve">Opus 5 (le plus capable)</w:t>
+            </w:r>
+          </w:p>
+        </w:tc>
+        <w:tc>
+          <w:tcPr>
+            <w:tcW w:type="dxa" w:w="2100"/>
+            <w:tcMar>
+              <w:top w:type="dxa" w:w="80"/>
+              <w:left w:type="dxa" w:w="100"/>
+              <w:bottom w:type="dxa" w:w="80"/>
+              <w:right w:type="dxa" w:w="100"/>
+            </w:tcMar>
+            <w:vAlign w:val="center"/>
+          </w:tcPr>
+          <w:p>
+            <w:r>
+              <w:rPr>
+                <w:b w:val="false"/>
+                <w:bCs w:val="false"/>
+                <w:sz w:val="20"/>
+                <w:szCs w:val="20"/>
+              </w:rPr>
+              <w:t xml:space="preserve">$5,00</w:t>
+            </w:r>
+          </w:p>
+        </w:tc>
+        <w:tc>
+          <w:tcPr>
+            <w:tcW w:type="dxa" w:w="2100"/>
+            <w:tcMar>
+              <w:top w:type="dxa" w:w="80"/>
+              <w:left w:type="dxa" w:w="100"/>
+              <w:bottom w:type="dxa" w:w="80"/>
+              <w:right w:type="dxa" w:w="100"/>
+            </w:tcMar>
+            <w:vAlign w:val="center"/>
+          </w:tcPr>
+          <w:p>
+            <w:r>
+              <w:rPr>
+                <w:b w:val="false"/>
+                <w:bCs w:val="false"/>
+                <w:sz w:val="20"/>
+                <w:szCs w:val="20"/>
+              </w:rPr>
+              <w:t xml:space="preserve">$25,00</w:t>
+            </w:r>
+          </w:p>
+        </w:tc>
+        <w:tc>
+          <w:tcPr>
+            <w:tcW w:type="dxa" w:w="1960"/>
+            <w:tcMar>
+              <w:top w:type="dxa" w:w="80"/>
+              <w:left w:type="dxa" w:w="100"/>
+              <w:bottom w:type="dxa" w:w="80"/>
+              <w:right w:type="dxa" w:w="100"/>
+            </w:tcMar>
+            <w:vAlign w:val="center"/>
+          </w:tcPr>
+          <w:p>
+            <w:r>
+              <w:rPr>
+                <w:b w:val="false"/>
+                <w:bCs w:val="false"/>
+                <w:sz w:val="20"/>
+                <w:szCs w:val="20"/>
+              </w:rPr>
+              <w:t xml:space="preserve">≈ $0,015</w:t>
+            </w:r>
+          </w:p>
+        </w:tc>
+      </w:tr>
+    </w:tbl>
+    <w:p>
+      <w:pPr>
+        <w:spacing w:after="100" w:before="250"/>
+      </w:pPr>
+    </w:p>
+    <w:p>
+      <w:pPr>
+        <w:pStyle w:val="Heading2"/>
+        <w:spacing w:after="100" w:before="200"/>
+      </w:pPr>
+      <w:r>
+        <w:t xml:space="preserve">Projection mensuelle (ordre de grandeur, ~1$ ≈ 0,92€)</w:t>
+      </w:r>
+    </w:p>
+    <w:tbl>
+      <w:tblPr>
+        <w:tblW w:type="dxa" w:w="9360"/>
+        <w:tblBorders>
+          <w:top w:val="single" w:color="auto" w:sz="4"/>
+          <w:left w:val="single" w:color="auto" w:sz="4"/>
+          <w:bottom w:val="single" w:color="auto" w:sz="4"/>
+          <w:right w:val="single" w:color="auto" w:sz="4"/>
+          <w:insideH w:val="single" w:color="auto" w:sz="4"/>
+          <w:insideV w:val="single" w:color="auto" w:sz="4"/>
+        </w:tblBorders>
+      </w:tblPr>
+      <w:tblGrid>
+        <w:gridCol w:w="2400"/>
+        <w:gridCol w:w="2320"/>
+        <w:gridCol w:w="2320"/>
+        <w:gridCol w:w="2320"/>
+      </w:tblGrid>
+      <w:tr>
+        <w:tc>
+          <w:tcPr>
+            <w:tcW w:type="dxa" w:w="2400"/>
+            <w:shd w:fill="540E28" w:val="clear"/>
+            <w:tcMar>
+              <w:top w:type="dxa" w:w="80"/>
+              <w:left w:type="dxa" w:w="100"/>
+              <w:bottom w:type="dxa" w:w="80"/>
+              <w:right w:type="dxa" w:w="100"/>
+            </w:tcMar>
+            <w:vAlign w:val="center"/>
+          </w:tcPr>
+          <w:p>
+            <w:r>
+              <w:rPr>
+                <w:b/>
+                <w:bCs/>
+                <w:color w:val="FFFFFF"/>
+                <w:sz w:val="20"/>
+                <w:szCs w:val="20"/>
+              </w:rPr>
+              <w:t xml:space="preserve">Volume / mois</w:t>
+            </w:r>
+          </w:p>
+        </w:tc>
+        <w:tc>
+          <w:tcPr>
+            <w:tcW w:type="dxa" w:w="2320"/>
+            <w:shd w:fill="540E28" w:val="clear"/>
+            <w:tcMar>
+              <w:top w:type="dxa" w:w="80"/>
+              <w:left w:type="dxa" w:w="100"/>
+              <w:bottom w:type="dxa" w:w="80"/>
+              <w:right w:type="dxa" w:w="100"/>
+            </w:tcMar>
+            <w:vAlign w:val="center"/>
+          </w:tcPr>
+          <w:p>
+            <w:r>
+              <w:rPr>
+                <w:b/>
+                <w:bCs/>
+                <w:color w:val="FFFFFF"/>
+                <w:sz w:val="20"/>
+                <w:szCs w:val="20"/>
+              </w:rPr>
+              <w:t xml:space="preserve">Haiku 4.5</w:t>
+            </w:r>
+          </w:p>
+        </w:tc>
+        <w:tc>
+          <w:tcPr>
+            <w:tcW w:type="dxa" w:w="2320"/>
+            <w:shd w:fill="540E28" w:val="clear"/>
+            <w:tcMar>
+              <w:top w:type="dxa" w:w="80"/>
+              <w:left w:type="dxa" w:w="100"/>
+              <w:bottom w:type="dxa" w:w="80"/>
+              <w:right w:type="dxa" w:w="100"/>
+            </w:tcMar>
+            <w:vAlign w:val="center"/>
+          </w:tcPr>
+          <w:p>
+            <w:r>
+              <w:rPr>
+                <w:b/>
+                <w:bCs/>
+                <w:color w:val="FFFFFF"/>
+                <w:sz w:val="20"/>
+                <w:szCs w:val="20"/>
+              </w:rPr>
+              <w:t xml:space="preserve">Sonnet 5</w:t>
+            </w:r>
+          </w:p>
+        </w:tc>
+        <w:tc>
+          <w:tcPr>
+            <w:tcW w:type="dxa" w:w="2320"/>
+            <w:shd w:fill="540E28" w:val="clear"/>
+            <w:tcMar>
+              <w:top w:type="dxa" w:w="80"/>
+              <w:left w:type="dxa" w:w="100"/>
+              <w:bottom w:type="dxa" w:w="80"/>
+              <w:right w:type="dxa" w:w="100"/>
+            </w:tcMar>
+            <w:vAlign w:val="center"/>
+          </w:tcPr>
+          <w:p>
+            <w:r>
+              <w:rPr>
+                <w:b/>
+                <w:bCs/>
+                <w:color w:val="FFFFFF"/>
+                <w:sz w:val="20"/>
+                <w:szCs w:val="20"/>
+              </w:rPr>
+              <w:t xml:space="preserve">Opus 5</w:t>
+            </w:r>
+          </w:p>
+        </w:tc>
+      </w:tr>
+      <w:tr>
+        <w:tc>
+          <w:tcPr>
+            <w:tcW w:type="dxa" w:w="2400"/>
+            <w:tcMar>
+              <w:top w:type="dxa" w:w="80"/>
+              <w:left w:type="dxa" w:w="100"/>
+              <w:bottom w:type="dxa" w:w="80"/>
+              <w:right w:type="dxa" w:w="100"/>
+            </w:tcMar>
+            <w:vAlign w:val="center"/>
+          </w:tcPr>
+          <w:p>
+            <w:r>
+              <w:rPr>
+                <w:b w:val="false"/>
+                <w:bCs w:val="false"/>
+                <w:sz w:val="20"/>
+                <w:szCs w:val="20"/>
+              </w:rPr>
+              <w:t xml:space="preserve">1 000 photos</w:t>
+            </w:r>
+          </w:p>
+        </w:tc>
+        <w:tc>
+          <w:tcPr>
+            <w:tcW w:type="dxa" w:w="2320"/>
+            <w:tcMar>
+              <w:top w:type="dxa" w:w="80"/>
+              <w:left w:type="dxa" w:w="100"/>
+              <w:bottom w:type="dxa" w:w="80"/>
+              <w:right w:type="dxa" w:w="100"/>
+            </w:tcMar>
+            <w:vAlign w:val="center"/>
+          </w:tcPr>
+          <w:p>
+            <w:r>
+              <w:rPr>
+                <w:b w:val="false"/>
+                <w:bCs w:val="false"/>
+                <w:sz w:val="20"/>
+                <w:szCs w:val="20"/>
+              </w:rPr>
+              <w:t xml:space="preserve">≈ 3 $ (2,8 €)</w:t>
+            </w:r>
+          </w:p>
+        </w:tc>
+        <w:tc>
+          <w:tcPr>
+            <w:tcW w:type="dxa" w:w="2320"/>
+            <w:tcMar>
+              <w:top w:type="dxa" w:w="80"/>
+              <w:left w:type="dxa" w:w="100"/>
+              <w:bottom w:type="dxa" w:w="80"/>
+              <w:right w:type="dxa" w:w="100"/>
+            </w:tcMar>
+            <w:vAlign w:val="center"/>
+          </w:tcPr>
+          <w:p>
+            <w:r>
+              <w:rPr>
+                <w:b w:val="false"/>
+                <w:bCs w:val="false"/>
+                <w:sz w:val="20"/>
+                <w:szCs w:val="20"/>
+              </w:rPr>
+              <w:t xml:space="preserve">≈ 6 $ (5,5 €)</w:t>
+            </w:r>
+          </w:p>
+        </w:tc>
+        <w:tc>
+          <w:tcPr>
+            <w:tcW w:type="dxa" w:w="2320"/>
+            <w:tcMar>
+              <w:top w:type="dxa" w:w="80"/>
+              <w:left w:type="dxa" w:w="100"/>
+              <w:bottom w:type="dxa" w:w="80"/>
+              <w:right w:type="dxa" w:w="100"/>
+            </w:tcMar>
+            <w:vAlign w:val="center"/>
+          </w:tcPr>
+          <w:p>
+            <w:r>
+              <w:rPr>
+                <w:b w:val="false"/>
+                <w:bCs w:val="false"/>
+                <w:sz w:val="20"/>
+                <w:szCs w:val="20"/>
+              </w:rPr>
+              <w:t xml:space="preserve">≈ 15 $ (14 €)</w:t>
+            </w:r>
+          </w:p>
+        </w:tc>
+      </w:tr>
+      <w:tr>
+        <w:tc>
+          <w:tcPr>
+            <w:tcW w:type="dxa" w:w="2400"/>
+            <w:tcMar>
+              <w:top w:type="dxa" w:w="80"/>
+              <w:left w:type="dxa" w:w="100"/>
+              <w:bottom w:type="dxa" w:w="80"/>
+              <w:right w:type="dxa" w:w="100"/>
+            </w:tcMar>
+            <w:vAlign w:val="center"/>
+          </w:tcPr>
+          <w:p>
+            <w:r>
+              <w:rPr>
+                <w:b w:val="false"/>
+                <w:bCs w:val="false"/>
+                <w:sz w:val="20"/>
+                <w:szCs w:val="20"/>
+              </w:rPr>
+              <w:t xml:space="preserve">10 000 photos</w:t>
+            </w:r>
+          </w:p>
+        </w:tc>
+        <w:tc>
+          <w:tcPr>
+            <w:tcW w:type="dxa" w:w="2320"/>
+            <w:tcMar>
+              <w:top w:type="dxa" w:w="80"/>
+              <w:left w:type="dxa" w:w="100"/>
+              <w:bottom w:type="dxa" w:w="80"/>
+              <w:right w:type="dxa" w:w="100"/>
+            </w:tcMar>
+            <w:vAlign w:val="center"/>
+          </w:tcPr>
+          <w:p>
+            <w:r>
+              <w:rPr>
+                <w:b w:val="false"/>
+                <w:bCs w:val="false"/>
+                <w:sz w:val="20"/>
+                <w:szCs w:val="20"/>
+              </w:rPr>
+              <w:t xml:space="preserve">≈ 30 $ (28 €)</w:t>
+            </w:r>
+          </w:p>
+        </w:tc>
+        <w:tc>
+          <w:tcPr>
+            <w:tcW w:type="dxa" w:w="2320"/>
+            <w:tcMar>
+              <w:top w:type="dxa" w:w="80"/>
+              <w:left w:type="dxa" w:w="100"/>
+              <w:bottom w:type="dxa" w:w="80"/>
+              <w:right w:type="dxa" w:w="100"/>
+            </w:tcMar>
+            <w:vAlign w:val="center"/>
+          </w:tcPr>
+          <w:p>
+            <w:r>
+              <w:rPr>
+                <w:b w:val="false"/>
+                <w:bCs w:val="false"/>
+                <w:sz w:val="20"/>
+                <w:szCs w:val="20"/>
+              </w:rPr>
+              <w:t xml:space="preserve">≈ 60 $ (55 €)</w:t>
+            </w:r>
+          </w:p>
+        </w:tc>
+        <w:tc>
+          <w:tcPr>
+            <w:tcW w:type="dxa" w:w="2320"/>
+            <w:tcMar>
+              <w:top w:type="dxa" w:w="80"/>
+              <w:left w:type="dxa" w:w="100"/>
+              <w:bottom w:type="dxa" w:w="80"/>
+              <w:right w:type="dxa" w:w="100"/>
+            </w:tcMar>
+            <w:vAlign w:val="center"/>
+          </w:tcPr>
+          <w:p>
+            <w:r>
+              <w:rPr>
+                <w:b w:val="false"/>
+                <w:bCs w:val="false"/>
+                <w:sz w:val="20"/>
+                <w:szCs w:val="20"/>
+              </w:rPr>
+              <w:t xml:space="preserve">≈ 150 $ (138 €)</w:t>
+            </w:r>
+          </w:p>
+        </w:tc>
+      </w:tr>
+    </w:tbl>
+    <w:p>
+      <w:pPr>
+        <w:spacing w:after="200"/>
+      </w:pPr>
+      <w:r>
+        <w:t xml:space="preserve">Pour une tâche de classification comme celle-ci (pas du raisonnement complexe), Haiku 4.5 ou Sonnet 5 suffisent probablement — pas besoin d'Opus 5 a priori, à réserver au cas où la fiabilité de détection s'avère insuffisante sur les modèles plus légers. À confirmer empiriquement une fois les photos d'exemple disponibles pour tester la précision réelle sur chaque modèle.</w:t>
+      </w:r>
+    </w:p>
+    <w:p>
+      <w:pPr>
+        <w:spacing w:after="200"/>
+      </w:pPr>
+      <w:r>
+        <w:rPr>
+          <w:i/>
+          <w:iCs/>
+          <w:color w:val="555555"/>
+        </w:rPr>
+        <w:t xml:space="preserve">Ces chiffres sont des ordres de grandeur, pas une facture — le coût réel dépendra de la taille effective des photos et de la longueur finale du prompt, à mesurer une fois le premier prototype branché. Ils n'incluent pas l'hébergement Supabase (reste en free tier comme le reste du projet UrBizia).</w:t>
       </w:r>
     </w:p>
     <w:p>
@@ -366,6 +1204,18 @@
       </w:pPr>
     </w:lvl>
   </w:abstractNum>
+  <w:abstractNum w:abstractNumId="3" w15:restartNumberingAfterBreak="0">
+    <w:multiLevelType w:val="hybridMultilevel"/>
+    <w:lvl w:ilvl="0" w15:tentative="1">
+      <w:start w:val="1"/>
+      <w:numFmt w:val="bullet"/>
+      <w:lvlText w:val="•"/>
+      <w:lvlJc w:val="start"/>
+      <w:pPr>
+        <w:ind w:left="450" w:hanging="300"/>
+      </w:pPr>
+    </w:lvl>
+  </w:abstractNum>
   <w:num w:numId="1">
     <w:abstractNumId w:val="1"/>
     <w:lvlOverride w:ilvl="0">
@@ -374,6 +1224,12 @@
   </w:num>
   <w:num w:numId="2">
     <w:abstractNumId w:val="2"/>
+    <w:lvlOverride w:ilvl="0">
+      <w:startOverride w:val="1"/>
+    </w:lvlOverride>
+  </w:num>
+  <w:num w:numId="3">
+    <w:abstractNumId w:val="3"/>
     <w:lvlOverride w:ilvl="0">
       <w:startOverride w:val="1"/>
     </w:lvlOverride>

</xml_diff>